<commit_message>
Ajustes reportes y endosos de fianzas
</commit_message>
<xml_diff>
--- a/Reportes/EndosoOrdenProcederFianza.docx
+++ b/Reportes/EndosoOrdenProcederFianza.docx
@@ -89,25 +89,7 @@
                 <w:sz w:val="16"/>
                 <w:szCs w:val="16"/>
               </w:rPr>
-              <w:t>{</w:t>
-            </w:r>
-            <w:proofErr w:type="spellStart"/>
-            <w:r>
-              <w:rPr>
-                <w:rFonts w:ascii="Arial" w:hAnsi="Arial" w:cs="Arial"/>
-                <w:sz w:val="16"/>
-                <w:szCs w:val="16"/>
-              </w:rPr>
-              <w:t>Endoso.Id</w:t>
-            </w:r>
-            <w:proofErr w:type="spellEnd"/>
-            <w:r>
-              <w:rPr>
-                <w:rFonts w:ascii="Arial" w:hAnsi="Arial" w:cs="Arial"/>
-                <w:sz w:val="16"/>
-                <w:szCs w:val="16"/>
-              </w:rPr>
-              <w:t>}</w:t>
+              <w:t>{Endoso.Id}</w:t>
             </w:r>
           </w:p>
         </w:tc>
@@ -162,7 +144,6 @@
               </w:rPr>
               <w:t>{</w:t>
             </w:r>
-            <w:proofErr w:type="spellStart"/>
             <w:r>
               <w:rPr>
                 <w:rFonts w:ascii="Arial" w:hAnsi="Arial" w:cs="Arial"/>
@@ -179,17 +160,7 @@
                 <w:sz w:val="16"/>
                 <w:szCs w:val="16"/>
               </w:rPr>
-              <w:t>ode</w:t>
-            </w:r>
-            <w:proofErr w:type="spellEnd"/>
-            <w:r>
-              <w:rPr>
-                <w:rFonts w:ascii="Arial" w:hAnsi="Arial" w:cs="Arial"/>
-                <w:spacing w:val="-2"/>
-                <w:sz w:val="16"/>
-                <w:szCs w:val="16"/>
-              </w:rPr>
-              <w:t>}</w:t>
+              <w:t>ode}</w:t>
             </w:r>
           </w:p>
         </w:tc>
@@ -243,7 +214,6 @@
               </w:rPr>
               <w:t>{</w:t>
             </w:r>
-            <w:proofErr w:type="spellStart"/>
             <w:r>
               <w:rPr>
                 <w:rFonts w:ascii="Arial" w:hAnsi="Arial" w:cs="Arial"/>
@@ -268,7 +238,6 @@
               </w:rPr>
               <w:t>Tenedor</w:t>
             </w:r>
-            <w:proofErr w:type="spellEnd"/>
             <w:r>
               <w:rPr>
                 <w:rFonts w:ascii="Arial" w:hAnsi="Arial" w:cs="Arial"/>
@@ -346,7 +315,6 @@
               </w:rPr>
               <w:t>{</w:t>
             </w:r>
-            <w:proofErr w:type="spellStart"/>
             <w:r>
               <w:rPr>
                 <w:rFonts w:ascii="Arial" w:hAnsi="Arial" w:cs="Arial"/>
@@ -361,24 +329,7 @@
                 <w:sz w:val="16"/>
                 <w:szCs w:val="16"/>
               </w:rPr>
-              <w:t>Fianza</w:t>
-            </w:r>
-            <w:r>
-              <w:rPr>
-                <w:rFonts w:ascii="Arial" w:hAnsi="Arial" w:cs="Arial"/>
-                <w:sz w:val="16"/>
-                <w:szCs w:val="16"/>
-              </w:rPr>
-              <w:t>.SumaTextoTotal</w:t>
-            </w:r>
-            <w:proofErr w:type="spellEnd"/>
-            <w:r>
-              <w:rPr>
-                <w:rFonts w:ascii="Arial" w:hAnsi="Arial" w:cs="Arial"/>
-                <w:sz w:val="16"/>
-                <w:szCs w:val="16"/>
-              </w:rPr>
-              <w:t>}</w:t>
+              <w:t>Fianza.SumaTextoTotal}</w:t>
             </w:r>
           </w:p>
         </w:tc>
@@ -449,7 +400,6 @@
               </w:rPr>
               <w:t>{</w:t>
             </w:r>
-            <w:proofErr w:type="spellStart"/>
             <w:r>
               <w:rPr>
                 <w:rFonts w:ascii="Arial" w:hAnsi="Arial" w:cs="Arial"/>
@@ -464,24 +414,7 @@
                 <w:sz w:val="16"/>
                 <w:szCs w:val="16"/>
               </w:rPr>
-              <w:t>Fianza</w:t>
-            </w:r>
-            <w:r>
-              <w:rPr>
-                <w:rFonts w:ascii="Arial" w:hAnsi="Arial" w:cs="Arial"/>
-                <w:sz w:val="16"/>
-                <w:szCs w:val="16"/>
-              </w:rPr>
-              <w:t>.AFavor</w:t>
-            </w:r>
-            <w:proofErr w:type="spellEnd"/>
-            <w:r>
-              <w:rPr>
-                <w:rFonts w:ascii="Arial" w:hAnsi="Arial" w:cs="Arial"/>
-                <w:sz w:val="16"/>
-                <w:szCs w:val="16"/>
-              </w:rPr>
-              <w:t>} / CONTRALORÍA GENERAL DE LA REPÚBLICA</w:t>
+              <w:t>Fianza.AFavor} / CONTRALORÍA GENERAL DE LA REPÚBLICA</w:t>
             </w:r>
           </w:p>
         </w:tc>
@@ -552,7 +485,6 @@
               </w:rPr>
               <w:t>{</w:t>
             </w:r>
-            <w:proofErr w:type="spellStart"/>
             <w:r>
               <w:rPr>
                 <w:rFonts w:ascii="Arial" w:hAnsi="Arial" w:cs="Arial"/>
@@ -567,15 +499,7 @@
                 <w:sz w:val="16"/>
                 <w:szCs w:val="16"/>
               </w:rPr>
-              <w:t>Fianza</w:t>
-            </w:r>
-            <w:r>
-              <w:rPr>
-                <w:rFonts w:ascii="Arial" w:hAnsi="Arial" w:cs="Arial"/>
-                <w:sz w:val="16"/>
-                <w:szCs w:val="16"/>
-              </w:rPr>
-              <w:t>.</w:t>
+              <w:t>Fianza.</w:t>
             </w:r>
             <w:r>
               <w:rPr>
@@ -585,7 +509,6 @@
               </w:rPr>
               <w:t>Descripcion</w:t>
             </w:r>
-            <w:proofErr w:type="spellEnd"/>
             <w:r>
               <w:rPr>
                 <w:rFonts w:ascii="Arial" w:hAnsi="Arial" w:cs="Arial"/>
@@ -673,9 +596,8 @@
                 <w:sz w:val="16"/>
                 <w:szCs w:val="16"/>
               </w:rPr>
-              <w:t xml:space="preserve"> {</w:t>
-            </w:r>
-            <w:proofErr w:type="spellStart"/>
+              <w:t xml:space="preserve"> {DocumentoFianza.DiasVigencia}</w:t>
+            </w:r>
             <w:r>
               <w:rPr>
                 <w:rFonts w:ascii="Arial" w:hAnsi="Arial" w:cs="Arial"/>
@@ -684,50 +606,7 @@
                 <w:sz w:val="16"/>
                 <w:szCs w:val="16"/>
               </w:rPr>
-              <w:t>DocumentoFianza.DiasVigencia</w:t>
-            </w:r>
-            <w:proofErr w:type="spellEnd"/>
-            <w:r>
-              <w:rPr>
-                <w:rFonts w:ascii="Arial" w:hAnsi="Arial" w:cs="Arial"/>
-                <w:color w:val="000000"/>
-                <w:kern w:val="0"/>
-                <w:sz w:val="16"/>
-                <w:szCs w:val="16"/>
-              </w:rPr>
-              <w:t>}</w:t>
-            </w:r>
-            <w:r>
-              <w:rPr>
-                <w:rFonts w:ascii="Arial" w:hAnsi="Arial" w:cs="Arial"/>
-                <w:color w:val="000000"/>
-                <w:kern w:val="0"/>
-                <w:sz w:val="16"/>
-                <w:szCs w:val="16"/>
-              </w:rPr>
-              <w:t xml:space="preserve"> </w:t>
-            </w:r>
-            <w:proofErr w:type="gramStart"/>
-            <w:r>
-              <w:rPr>
-                <w:rFonts w:ascii="Arial" w:hAnsi="Arial" w:cs="Arial"/>
-                <w:color w:val="000000"/>
-                <w:kern w:val="0"/>
-                <w:sz w:val="16"/>
-                <w:szCs w:val="16"/>
-              </w:rPr>
-              <w:t>DIAS  A</w:t>
-            </w:r>
-            <w:proofErr w:type="gramEnd"/>
-            <w:r>
-              <w:rPr>
-                <w:rFonts w:ascii="Arial" w:hAnsi="Arial" w:cs="Arial"/>
-                <w:color w:val="000000"/>
-                <w:kern w:val="0"/>
-                <w:sz w:val="16"/>
-                <w:szCs w:val="16"/>
-              </w:rPr>
-              <w:t xml:space="preserve"> PARTIR  DE LA ORDEN DE PROCEDER</w:t>
+              <w:t xml:space="preserve"> DIAS  A PARTIR  DE LA ORDEN DE PROCEDER</w:t>
             </w:r>
             <w:r>
               <w:rPr>
@@ -831,21 +710,12 @@
                 <w:bCs/>
               </w:rPr>
             </w:pPr>
-            <w:proofErr w:type="spellStart"/>
-            <w:r>
-              <w:rPr>
-                <w:b/>
-                <w:bCs/>
-              </w:rPr>
-              <w:t>Apartir</w:t>
-            </w:r>
-            <w:proofErr w:type="spellEnd"/>
-            <w:r>
-              <w:rPr>
-                <w:b/>
-                <w:bCs/>
-              </w:rPr>
-              <w:t xml:space="preserve"> del </w:t>
+            <w:r>
+              <w:rPr>
+                <w:b/>
+                <w:bCs/>
+              </w:rPr>
+              <w:t xml:space="preserve">Apartir del </w:t>
             </w:r>
             <w:r>
               <w:rPr>
@@ -854,15 +724,13 @@
               </w:rPr>
               <w:t>{</w:t>
             </w:r>
-            <w:proofErr w:type="spellStart"/>
-            <w:r>
-              <w:rPr>
-                <w:b/>
-                <w:bCs/>
-              </w:rPr>
-              <w:t>FechaInicioVigencia</w:t>
-            </w:r>
-            <w:proofErr w:type="spellEnd"/>
+            <w:r>
+              <w:rPr>
+                <w:b/>
+                <w:bCs/>
+              </w:rPr>
+              <w:t>FechaEfectiva</w:t>
+            </w:r>
             <w:r>
               <w:rPr>
                 <w:b/>
@@ -994,29 +862,7 @@
           <w:sz w:val="18"/>
           <w:szCs w:val="18"/>
         </w:rPr>
-        <w:t>Firmado hoy, {</w:t>
-      </w:r>
-      <w:proofErr w:type="spellStart"/>
-      <w:r>
-        <w:rPr>
-          <w:rFonts w:ascii="Arial" w:hAnsi="Arial" w:cs="Arial"/>
-          <w:color w:val="000000"/>
-          <w:kern w:val="0"/>
-          <w:sz w:val="18"/>
-          <w:szCs w:val="18"/>
-        </w:rPr>
-        <w:t>DocumentoFianza.FechaActual</w:t>
-      </w:r>
-      <w:proofErr w:type="spellEnd"/>
-      <w:r>
-        <w:rPr>
-          <w:rFonts w:ascii="Arial" w:hAnsi="Arial" w:cs="Arial"/>
-          <w:color w:val="000000"/>
-          <w:kern w:val="0"/>
-          <w:sz w:val="18"/>
-          <w:szCs w:val="18"/>
-        </w:rPr>
-        <w:t>}</w:t>
+        <w:t>Firmado hoy, {DocumentoFianza.FechaActual}</w:t>
       </w:r>
     </w:p>
     <w:p>
@@ -1108,24 +954,29 @@
                 <w:sz w:val="20"/>
                 <w:szCs w:val="20"/>
               </w:rPr>
-              <w:t xml:space="preserve">ASEGURADOR GLOBAL, </w:t>
-            </w:r>
-            <w:proofErr w:type="gramStart"/>
-            <w:r>
+              <w:t>ASEGURADOR GLOBAL, S.A</w:t>
+            </w:r>
+          </w:p>
+        </w:tc>
+        <w:tc>
+          <w:tcPr>
+            <w:tcW w:w="992" w:type="dxa"/>
+          </w:tcPr>
+          <w:p>
+            <w:pPr>
+              <w:jc w:val="center"/>
               <w:rPr>
                 <w:b/>
                 <w:bCs/>
                 <w:sz w:val="20"/>
                 <w:szCs w:val="20"/>
               </w:rPr>
-              <w:t>S.A</w:t>
-            </w:r>
-            <w:proofErr w:type="gramEnd"/>
-          </w:p>
-        </w:tc>
-        <w:tc>
-          <w:tcPr>
-            <w:tcW w:w="992" w:type="dxa"/>
+            </w:pPr>
+          </w:p>
+        </w:tc>
+        <w:tc>
+          <w:tcPr>
+            <w:tcW w:w="4575" w:type="dxa"/>
           </w:tcPr>
           <w:p>
             <w:pPr>
@@ -1137,70 +988,34 @@
                 <w:szCs w:val="20"/>
               </w:rPr>
             </w:pPr>
-          </w:p>
-        </w:tc>
-        <w:tc>
-          <w:tcPr>
-            <w:tcW w:w="4575" w:type="dxa"/>
-          </w:tcPr>
-          <w:p>
-            <w:pPr>
-              <w:jc w:val="center"/>
+            <w:r>
               <w:rPr>
                 <w:b/>
                 <w:bCs/>
                 <w:sz w:val="20"/>
                 <w:szCs w:val="20"/>
               </w:rPr>
-            </w:pPr>
-            <w:r>
+              <w:t>POR EL CONTRATISTA</w:t>
+            </w:r>
+          </w:p>
+          <w:p>
+            <w:pPr>
+              <w:jc w:val="center"/>
               <w:rPr>
                 <w:b/>
                 <w:bCs/>
                 <w:sz w:val="20"/>
                 <w:szCs w:val="20"/>
               </w:rPr>
-              <w:t>POR EL CONTRATISTA</w:t>
-            </w:r>
-          </w:p>
-          <w:p>
-            <w:pPr>
-              <w:jc w:val="center"/>
+            </w:pPr>
+            <w:r>
               <w:rPr>
                 <w:b/>
                 <w:bCs/>
                 <w:sz w:val="20"/>
                 <w:szCs w:val="20"/>
               </w:rPr>
-            </w:pPr>
-            <w:r>
-              <w:rPr>
-                <w:b/>
-                <w:bCs/>
-                <w:sz w:val="20"/>
-                <w:szCs w:val="20"/>
-              </w:rPr>
-              <w:t>{</w:t>
-            </w:r>
-            <w:proofErr w:type="spellStart"/>
-            <w:r>
-              <w:rPr>
-                <w:b/>
-                <w:bCs/>
-                <w:sz w:val="20"/>
-                <w:szCs w:val="20"/>
-              </w:rPr>
-              <w:t>DocumentoFianza.Tenedor</w:t>
-            </w:r>
-            <w:proofErr w:type="spellEnd"/>
-            <w:r>
-              <w:rPr>
-                <w:b/>
-                <w:bCs/>
-                <w:sz w:val="20"/>
-                <w:szCs w:val="20"/>
-              </w:rPr>
-              <w:t>}</w:t>
+              <w:t>{DocumentoFianza.Tenedor}</w:t>
             </w:r>
           </w:p>
         </w:tc>

</xml_diff>